<commit_message>
Progress made piece 2
</commit_message>
<xml_diff>
--- a/Working Folder/[In Progress] 2 Stephen Yip 叶树坚 - Nine Actors 九角子/2 Stephen Yip 叶树坚 - Nine Actors 九角子 - Errata_v1.docx
+++ b/Working Folder/[In Progress] 2 Stephen Yip 叶树坚 - Nine Actors 九角子/2 Stephen Yip 叶树坚 - Nine Actors 九角子 - Errata_v1.docx
@@ -709,21 +709,13 @@
               <w:rPr>
                 <w:rFonts w:ascii="Times New Roman" w:hAnsi="Times New Roman" w:cs="Times New Roman"/>
               </w:rPr>
-              <w:t xml:space="preserve">Awkward pizz. </w:t>
+              <w:t>Awkward pizz. gliss.</w:t>
             </w:r>
-            <w:proofErr w:type="spellStart"/>
             <w:r>
               <w:rPr>
                 <w:rFonts w:ascii="Times New Roman" w:hAnsi="Times New Roman" w:cs="Times New Roman"/>
               </w:rPr>
-              <w:t>gliss</w:t>
-            </w:r>
-            <w:proofErr w:type="spellEnd"/>
-            <w:r>
-              <w:rPr>
-                <w:rFonts w:ascii="Times New Roman" w:hAnsi="Times New Roman" w:cs="Times New Roman"/>
-              </w:rPr>
-              <w:t>.</w:t>
+              <w:t xml:space="preserve"> chord?</w:t>
             </w:r>
           </w:p>
         </w:tc>

</xml_diff>

<commit_message>
Piece 2 editing finished. Updated errata list
</commit_message>
<xml_diff>
--- a/Working Folder/[In Progress] 2 Stephen Yip 叶树坚 - Nine Actors 九角子/2 Stephen Yip 叶树坚 - Nine Actors 九角子 - Errata_v1.docx
+++ b/Working Folder/[In Progress] 2 Stephen Yip 叶树坚 - Nine Actors 九角子/2 Stephen Yip 叶树坚 - Nine Actors 九角子 - Errata_v1.docx
@@ -506,7 +506,7 @@
               <w:rPr>
                 <w:rFonts w:ascii="Times New Roman" w:hAnsi="Times New Roman" w:cs="Times New Roman"/>
               </w:rPr>
-              <w:t>54</w:t>
+              <w:t>1</w:t>
             </w:r>
           </w:p>
         </w:tc>
@@ -525,7 +525,7 @@
               <w:rPr>
                 <w:rFonts w:ascii="Times New Roman" w:hAnsi="Times New Roman" w:cs="Times New Roman"/>
               </w:rPr>
-              <w:t>Cello</w:t>
+              <w:t>Timpani</w:t>
             </w:r>
           </w:p>
         </w:tc>
@@ -544,20 +544,31 @@
               <w:rPr>
                 <w:rFonts w:ascii="Times New Roman" w:hAnsi="Times New Roman" w:cs="Times New Roman"/>
               </w:rPr>
-              <w:t xml:space="preserve">Is the tremolo intentional? </w:t>
-            </w:r>
-          </w:p>
-          <w:p>
-            <w:pPr>
-              <w:rPr>
-                <w:rFonts w:ascii="Times New Roman" w:hAnsi="Times New Roman" w:cs="Times New Roman"/>
-              </w:rPr>
-            </w:pPr>
-            <w:r>
-              <w:rPr>
-                <w:rFonts w:ascii="Times New Roman" w:hAnsi="Times New Roman" w:cs="Times New Roman" w:hint="eastAsia"/>
-              </w:rPr>
-              <w:t>顫音是故意的嗎？</w:t>
+              <w:t>What does “C</w:t>
+            </w:r>
+            <w:r>
+              <w:rPr>
+                <w:rFonts w:ascii="Times New Roman" w:hAnsi="Times New Roman" w:cs="Times New Roman"/>
+              </w:rPr>
+              <w:t>ymbal (upside down)</w:t>
+            </w:r>
+            <w:r>
+              <w:rPr>
+                <w:rFonts w:ascii="Times New Roman" w:hAnsi="Times New Roman" w:cs="Times New Roman"/>
+              </w:rPr>
+              <w:t xml:space="preserve"> bowing”? Is the timpanist bowing an upside</w:t>
+            </w:r>
+            <w:r>
+              <w:rPr>
+                <w:rFonts w:ascii="Times New Roman" w:hAnsi="Times New Roman" w:cs="Times New Roman"/>
+              </w:rPr>
+              <w:t>-</w:t>
+            </w:r>
+            <w:r>
+              <w:rPr>
+                <w:rFonts w:ascii="Times New Roman" w:hAnsi="Times New Roman" w:cs="Times New Roman"/>
+              </w:rPr>
+              <w:t xml:space="preserve">down cymbal placed on top of one of the timpani membranes? </w:t>
             </w:r>
           </w:p>
         </w:tc>
@@ -595,7 +606,7 @@
               <w:rPr>
                 <w:rFonts w:ascii="Times New Roman" w:hAnsi="Times New Roman" w:cs="Times New Roman"/>
               </w:rPr>
-              <w:t>83-91</w:t>
+              <w:t>54</w:t>
             </w:r>
           </w:p>
         </w:tc>
@@ -614,7 +625,7 @@
               <w:rPr>
                 <w:rFonts w:ascii="Times New Roman" w:hAnsi="Times New Roman" w:cs="Times New Roman"/>
               </w:rPr>
-              <w:t>Perc IV</w:t>
+              <w:t>Cello</w:t>
             </w:r>
           </w:p>
         </w:tc>
@@ -633,7 +644,20 @@
               <w:rPr>
                 <w:rFonts w:ascii="Times New Roman" w:hAnsi="Times New Roman" w:cs="Times New Roman"/>
               </w:rPr>
-              <w:t xml:space="preserve">What instrument is playing this passage? </w:t>
+              <w:t xml:space="preserve">Is the tremolo intentional? </w:t>
+            </w:r>
+          </w:p>
+          <w:p>
+            <w:pPr>
+              <w:rPr>
+                <w:rFonts w:ascii="Times New Roman" w:hAnsi="Times New Roman" w:cs="Times New Roman"/>
+              </w:rPr>
+            </w:pPr>
+            <w:r>
+              <w:rPr>
+                <w:rFonts w:ascii="Times New Roman" w:hAnsi="Times New Roman" w:cs="Times New Roman" w:hint="eastAsia"/>
+              </w:rPr>
+              <w:t>顫音是故意的嗎？</w:t>
             </w:r>
           </w:p>
         </w:tc>
@@ -671,7 +695,7 @@
               <w:rPr>
                 <w:rFonts w:ascii="Times New Roman" w:hAnsi="Times New Roman" w:cs="Times New Roman"/>
               </w:rPr>
-              <w:t>105</w:t>
+              <w:t>83-91</w:t>
             </w:r>
           </w:p>
         </w:tc>
@@ -690,7 +714,7 @@
               <w:rPr>
                 <w:rFonts w:ascii="Times New Roman" w:hAnsi="Times New Roman" w:cs="Times New Roman"/>
               </w:rPr>
-              <w:t>Cello</w:t>
+              <w:t>Perc IV</w:t>
             </w:r>
           </w:p>
         </w:tc>
@@ -709,13 +733,7 @@
               <w:rPr>
                 <w:rFonts w:ascii="Times New Roman" w:hAnsi="Times New Roman" w:cs="Times New Roman"/>
               </w:rPr>
-              <w:t>Awkward pizz. gliss.</w:t>
-            </w:r>
-            <w:r>
-              <w:rPr>
-                <w:rFonts w:ascii="Times New Roman" w:hAnsi="Times New Roman" w:cs="Times New Roman"/>
-              </w:rPr>
-              <w:t xml:space="preserve"> chord?</w:t>
+              <w:t xml:space="preserve">What instrument is playing this passage? </w:t>
             </w:r>
           </w:p>
         </w:tc>
@@ -753,7 +771,7 @@
               <w:rPr>
                 <w:rFonts w:ascii="Times New Roman" w:hAnsi="Times New Roman" w:cs="Times New Roman"/>
               </w:rPr>
-              <w:t>112-113</w:t>
+              <w:t>105</w:t>
             </w:r>
           </w:p>
         </w:tc>
@@ -772,7 +790,7 @@
               <w:rPr>
                 <w:rFonts w:ascii="Times New Roman" w:hAnsi="Times New Roman" w:cs="Times New Roman"/>
               </w:rPr>
-              <w:t>Perc V</w:t>
+              <w:t>Cello</w:t>
             </w:r>
           </w:p>
         </w:tc>
@@ -789,9 +807,102 @@
             </w:pPr>
             <w:r>
               <w:rPr>
-                <w:rFonts w:ascii="Times New Roman" w:hAnsi="Times New Roman" w:cs="Times New Roman"/>
-              </w:rPr>
-              <w:t xml:space="preserve">What instrument is playing this passage? </w:t>
+                <w:rFonts w:ascii="Times New Roman" w:hAnsi="Times New Roman" w:cs="Times New Roman" w:hint="eastAsia"/>
+              </w:rPr>
+              <w:t>Possible a</w:t>
+            </w:r>
+            <w:r>
+              <w:rPr>
+                <w:rFonts w:ascii="Times New Roman" w:hAnsi="Times New Roman" w:cs="Times New Roman"/>
+              </w:rPr>
+              <w:t>wkward pizz</w:t>
+            </w:r>
+            <w:r>
+              <w:rPr>
+                <w:rFonts w:ascii="Times New Roman" w:hAnsi="Times New Roman" w:cs="Times New Roman" w:hint="eastAsia"/>
+              </w:rPr>
+              <w:t>icato</w:t>
+            </w:r>
+            <w:r>
+              <w:rPr>
+                <w:rFonts w:ascii="Times New Roman" w:hAnsi="Times New Roman" w:cs="Times New Roman"/>
+              </w:rPr>
+              <w:t xml:space="preserve"> gliss</w:t>
+            </w:r>
+            <w:r>
+              <w:rPr>
+                <w:rFonts w:ascii="Times New Roman" w:hAnsi="Times New Roman" w:cs="Times New Roman" w:hint="eastAsia"/>
+              </w:rPr>
+              <w:t>ando</w:t>
+            </w:r>
+            <w:r>
+              <w:rPr>
+                <w:rFonts w:ascii="Times New Roman" w:hAnsi="Times New Roman" w:cs="Times New Roman"/>
+              </w:rPr>
+              <w:t xml:space="preserve"> </w:t>
+            </w:r>
+            <w:r>
+              <w:rPr>
+                <w:rFonts w:ascii="Times New Roman" w:hAnsi="Times New Roman" w:cs="Times New Roman" w:hint="eastAsia"/>
+              </w:rPr>
+              <w:t>c</w:t>
+            </w:r>
+            <w:r>
+              <w:rPr>
+                <w:rFonts w:ascii="Times New Roman" w:hAnsi="Times New Roman" w:cs="Times New Roman"/>
+              </w:rPr>
+              <w:t>hord</w:t>
+            </w:r>
+            <w:r>
+              <w:rPr>
+                <w:rFonts w:ascii="Times New Roman" w:hAnsi="Times New Roman" w:cs="Times New Roman" w:hint="eastAsia"/>
+              </w:rPr>
+              <w:t>.</w:t>
+            </w:r>
+          </w:p>
+          <w:p>
+            <w:pPr>
+              <w:rPr>
+                <w:rFonts w:ascii="Times New Roman" w:hAnsi="Times New Roman" w:cs="Times New Roman"/>
+                <w:lang w:eastAsia="zh-TW"/>
+              </w:rPr>
+            </w:pPr>
+            <w:r>
+              <w:rPr>
+                <w:rFonts w:ascii="Times New Roman" w:hAnsi="Times New Roman" w:cs="Times New Roman"/>
+                <w:lang w:eastAsia="zh-TW"/>
+              </w:rPr>
+              <w:t>和弦和</w:t>
+            </w:r>
+            <w:proofErr w:type="gramStart"/>
+            <w:r>
+              <w:rPr>
+                <w:rFonts w:ascii="Times New Roman" w:hAnsi="Times New Roman" w:cs="Times New Roman" w:hint="eastAsia"/>
+                <w:lang w:eastAsia="zh-TW"/>
+              </w:rPr>
+              <w:t>撥奏</w:t>
+            </w:r>
+            <w:r>
+              <w:rPr>
+                <w:rFonts w:ascii="Times New Roman" w:hAnsi="Times New Roman" w:cs="Times New Roman"/>
+                <w:lang w:eastAsia="zh-TW"/>
+              </w:rPr>
+              <w:t>和滑奏</w:t>
+            </w:r>
+            <w:proofErr w:type="gramEnd"/>
+            <w:r>
+              <w:rPr>
+                <w:rFonts w:ascii="Times New Roman" w:hAnsi="Times New Roman" w:cs="Times New Roman"/>
+                <w:lang w:eastAsia="zh-TW"/>
+              </w:rPr>
+              <w:t>可能太不方便</w:t>
+            </w:r>
+            <w:r>
+              <w:rPr>
+                <w:rFonts w:ascii="Times New Roman" w:hAnsi="Times New Roman" w:cs="Times New Roman" w:hint="eastAsia"/>
+                <w:lang w:eastAsia="zh-TW"/>
+              </w:rPr>
+              <w:t>。</w:t>
             </w:r>
           </w:p>
         </w:tc>
@@ -805,6 +916,7 @@
               <w:rPr>
                 <w:rFonts w:ascii="Times New Roman" w:hAnsi="Times New Roman" w:cs="Times New Roman"/>
                 <w:color w:val="FF0000"/>
+                <w:lang w:eastAsia="zh-TW"/>
               </w:rPr>
             </w:pPr>
           </w:p>
@@ -825,6 +937,12 @@
                 <w:rFonts w:ascii="Times New Roman" w:hAnsi="Times New Roman" w:cs="Times New Roman"/>
               </w:rPr>
             </w:pPr>
+            <w:r>
+              <w:rPr>
+                <w:rFonts w:ascii="Times New Roman" w:hAnsi="Times New Roman" w:cs="Times New Roman"/>
+              </w:rPr>
+              <w:t>112-113</w:t>
+            </w:r>
           </w:p>
         </w:tc>
         <w:tc>
@@ -838,6 +956,12 @@
                 <w:rFonts w:ascii="Times New Roman" w:hAnsi="Times New Roman" w:cs="Times New Roman"/>
               </w:rPr>
             </w:pPr>
+            <w:r>
+              <w:rPr>
+                <w:rFonts w:ascii="Times New Roman" w:hAnsi="Times New Roman" w:cs="Times New Roman"/>
+              </w:rPr>
+              <w:t>Perc V</w:t>
+            </w:r>
           </w:p>
         </w:tc>
         <w:tc>
@@ -851,6 +975,129 @@
                 <w:rFonts w:ascii="Times New Roman" w:hAnsi="Times New Roman" w:cs="Times New Roman"/>
               </w:rPr>
             </w:pPr>
+            <w:r>
+              <w:rPr>
+                <w:rFonts w:ascii="Times New Roman" w:hAnsi="Times New Roman" w:cs="Times New Roman"/>
+              </w:rPr>
+              <w:t xml:space="preserve">What instrument is playing this passage? </w:t>
+            </w:r>
+          </w:p>
+          <w:p>
+            <w:pPr>
+              <w:rPr>
+                <w:rFonts w:ascii="Times New Roman" w:hAnsi="Times New Roman" w:cs="Times New Roman" w:hint="eastAsia"/>
+              </w:rPr>
+            </w:pPr>
+            <w:r>
+              <w:rPr>
+                <w:rFonts w:ascii="Times New Roman" w:hAnsi="Times New Roman" w:cs="Times New Roman" w:hint="eastAsia"/>
+              </w:rPr>
+              <w:t>沒有樂器跡象。</w:t>
+            </w:r>
+          </w:p>
+        </w:tc>
+        <w:tc>
+          <w:tcPr>
+            <w:tcW w:w="2711" w:type="dxa"/>
+            <w:vAlign w:val="center"/>
+          </w:tcPr>
+          <w:p>
+            <w:pPr>
+              <w:rPr>
+                <w:rFonts w:ascii="Times New Roman" w:hAnsi="Times New Roman" w:cs="Times New Roman"/>
+                <w:color w:val="FF0000"/>
+              </w:rPr>
+            </w:pPr>
+          </w:p>
+        </w:tc>
+      </w:tr>
+      <w:tr>
+        <w:trPr>
+          <w:trHeight w:val="552"/>
+        </w:trPr>
+        <w:tc>
+          <w:tcPr>
+            <w:tcW w:w="1129" w:type="dxa"/>
+            <w:vAlign w:val="center"/>
+          </w:tcPr>
+          <w:p>
+            <w:pPr>
+              <w:rPr>
+                <w:rFonts w:ascii="Times New Roman" w:hAnsi="Times New Roman" w:cs="Times New Roman"/>
+              </w:rPr>
+            </w:pPr>
+            <w:r>
+              <w:rPr>
+                <w:rFonts w:ascii="Times New Roman" w:hAnsi="Times New Roman" w:cs="Times New Roman"/>
+              </w:rPr>
+              <w:t>129</w:t>
+            </w:r>
+          </w:p>
+        </w:tc>
+        <w:tc>
+          <w:tcPr>
+            <w:tcW w:w="1985" w:type="dxa"/>
+            <w:vAlign w:val="center"/>
+          </w:tcPr>
+          <w:p>
+            <w:pPr>
+              <w:rPr>
+                <w:rFonts w:ascii="Times New Roman" w:hAnsi="Times New Roman" w:cs="Times New Roman"/>
+              </w:rPr>
+            </w:pPr>
+            <w:r>
+              <w:rPr>
+                <w:rFonts w:ascii="Times New Roman" w:hAnsi="Times New Roman" w:cs="Times New Roman"/>
+              </w:rPr>
+              <w:t>Perc III</w:t>
+            </w:r>
+          </w:p>
+        </w:tc>
+        <w:tc>
+          <w:tcPr>
+            <w:tcW w:w="3260" w:type="dxa"/>
+            <w:vAlign w:val="center"/>
+          </w:tcPr>
+          <w:p>
+            <w:pPr>
+              <w:rPr>
+                <w:rFonts w:ascii="Times New Roman" w:hAnsi="Times New Roman" w:cs="Times New Roman"/>
+                <w:lang w:val="en-GB"/>
+              </w:rPr>
+            </w:pPr>
+            <w:r>
+              <w:rPr>
+                <w:rFonts w:ascii="Times New Roman" w:hAnsi="Times New Roman" w:cs="Times New Roman"/>
+                <w:lang w:val="en-GB"/>
+              </w:rPr>
+              <w:t xml:space="preserve">What does “Daba” mean?  </w:t>
+            </w:r>
+          </w:p>
+          <w:p>
+            <w:pPr>
+              <w:rPr>
+                <w:rFonts w:ascii="Times New Roman" w:hAnsi="Times New Roman" w:cs="Times New Roman"/>
+                <w:lang w:val="en-GB"/>
+              </w:rPr>
+            </w:pPr>
+            <w:r>
+              <w:rPr>
+                <w:rFonts w:ascii="Times New Roman" w:hAnsi="Times New Roman" w:cs="Times New Roman" w:hint="eastAsia"/>
+              </w:rPr>
+              <w:t>“</w:t>
+            </w:r>
+            <w:r>
+              <w:rPr>
+                <w:rFonts w:ascii="Times New Roman" w:hAnsi="Times New Roman" w:cs="Times New Roman" w:hint="eastAsia"/>
+              </w:rPr>
+              <w:t>大柭</w:t>
+            </w:r>
+            <w:r>
+              <w:rPr>
+                <w:rFonts w:ascii="Times New Roman" w:hAnsi="Times New Roman" w:cs="Times New Roman" w:hint="eastAsia"/>
+              </w:rPr>
+              <w:t>”的意思是什麽？</w:t>
+            </w:r>
           </w:p>
         </w:tc>
         <w:tc>
@@ -2480,6 +2727,27 @@
       <w:lang w:val="en-US" w:eastAsia="en-US"/>
     </w:rPr>
   </w:style>
+  <w:style w:type="character" w:styleId="Hyperlink">
+    <w:name w:val="Hyperlink"/>
+    <w:basedOn w:val="DefaultParagraphFont"/>
+    <w:uiPriority w:val="99"/>
+    <w:unhideWhenUsed/>
+    <w:rsid w:val="003C0494"/>
+    <w:rPr>
+      <w:color w:val="0563C1" w:themeColor="hyperlink"/>
+      <w:u w:val="single"/>
+    </w:rPr>
+  </w:style>
+  <w:style w:type="character" w:styleId="UnresolvedMention">
+    <w:name w:val="Unresolved Mention"/>
+    <w:basedOn w:val="DefaultParagraphFont"/>
+    <w:uiPriority w:val="99"/>
+    <w:rsid w:val="003C0494"/>
+    <w:rPr>
+      <w:color w:val="605E5C"/>
+      <w:shd w:val="clear" w:color="auto" w:fill="E1DFDD"/>
+    </w:rPr>
+  </w:style>
 </w:styles>
 </file>
 

</xml_diff>